<commit_message>
docs(api+risks): add error schema, RBAC section, and API versioning risk
Q5 – Add section 1.4 Role-Based Access Control to API Endpoint Design:
role definitions table (5 roles) and endpoint restriction table (15 endpoints).

Q6 – Add section 1.3 Standard Error Response to API Endpoint Design:
standard error JSON format, 502 detail field, 8-row error code reference
table, and 403 Forbidden row to the global status codes table.

Q7 – Add Risk 3.7 API Versioning / Backward Compatibility to Benefits and
Risks: risk description, 5-row mitigation table, and summary table row.

Co-Authored-By: Claude Sonnet 4.6 <noreply@anthropic.com>
</commit_message>
<xml_diff>
--- a/deliverable-docs/API Endpoint Design.docx
+++ b/deliverable-docs/API Endpoint Design.docx
@@ -280,31 +280,31 @@
       <w:tr>
         <w:tc>
           <w:tcPr>
-            <w:tcW w:w="2880" w:type="dxa"/>
-          </w:tcPr>
-          <w:p>
-            <w:r>
-              <w:t>404 Not Found</w:t>
-            </w:r>
-          </w:p>
-        </w:tc>
-        <w:tc>
-          <w:tcPr>
-            <w:tcW w:w="2880" w:type="dxa"/>
-          </w:tcPr>
-          <w:p>
-            <w:r>
-              <w:t>Resource missing</w:t>
-            </w:r>
-          </w:p>
-        </w:tc>
-        <w:tc>
-          <w:tcPr>
-            <w:tcW w:w="2880" w:type="dxa"/>
-          </w:tcPr>
-          <w:p>
-            <w:r>
-              <w:t>ID does not exist in this service's DB</w:t>
+            <w:tcW w:type="dxa" w:w="2880"/>
+          </w:tcPr>
+          <w:p>
+            <w:r>
+              <w:t>403 Forbidden</w:t>
+            </w:r>
+          </w:p>
+        </w:tc>
+        <w:tc>
+          <w:tcPr>
+            <w:tcW w:type="dxa" w:w="2880"/>
+          </w:tcPr>
+          <w:p>
+            <w:r>
+              <w:t>Insufficient role</w:t>
+            </w:r>
+          </w:p>
+        </w:tc>
+        <w:tc>
+          <w:tcPr>
+            <w:tcW w:type="dxa" w:w="2880"/>
+          </w:tcPr>
+          <w:p>
+            <w:r>
+              <w:t>Authenticated user lacks the required role for this endpoint</w:t>
             </w:r>
           </w:p>
         </w:tc>
@@ -316,7 +316,7 @@
           </w:tcPr>
           <w:p>
             <w:r>
-              <w:t>409 Conflict</w:t>
+              <w:t>404 Not Found</w:t>
             </w:r>
           </w:p>
         </w:tc>
@@ -326,7 +326,7 @@
           </w:tcPr>
           <w:p>
             <w:r>
-              <w:t>Duplicate resource</w:t>
+              <w:t>Resource missing</w:t>
             </w:r>
           </w:p>
         </w:tc>
@@ -336,7 +336,7 @@
           </w:tcPr>
           <w:p>
             <w:r>
-              <w:t>Unique constraint violation (e.g. duplicate email)</w:t>
+              <w:t>ID does not exist in this service's DB</w:t>
             </w:r>
           </w:p>
         </w:tc>
@@ -348,7 +348,7 @@
           </w:tcPr>
           <w:p>
             <w:r>
-              <w:t>502 Bad Gateway</w:t>
+              <w:t>409 Conflict</w:t>
             </w:r>
           </w:p>
         </w:tc>
@@ -358,7 +358,7 @@
           </w:tcPr>
           <w:p>
             <w:r>
-              <w:t>Upstream failure</w:t>
+              <w:t>Duplicate resource</w:t>
             </w:r>
           </w:p>
         </w:tc>
@@ -368,7 +368,7 @@
           </w:tcPr>
           <w:p>
             <w:r>
-              <w:t>A cross-service REST call failed</w:t>
+              <w:t>Unique constraint violation (e.g. duplicate email)</w:t>
             </w:r>
           </w:p>
         </w:tc>
@@ -380,6 +380,38 @@
           </w:tcPr>
           <w:p>
             <w:r>
+              <w:t>502 Bad Gateway</w:t>
+            </w:r>
+          </w:p>
+        </w:tc>
+        <w:tc>
+          <w:tcPr>
+            <w:tcW w:w="2880" w:type="dxa"/>
+          </w:tcPr>
+          <w:p>
+            <w:r>
+              <w:t>Upstream failure</w:t>
+            </w:r>
+          </w:p>
+        </w:tc>
+        <w:tc>
+          <w:tcPr>
+            <w:tcW w:w="2880" w:type="dxa"/>
+          </w:tcPr>
+          <w:p>
+            <w:r>
+              <w:t>A cross-service REST call failed</w:t>
+            </w:r>
+          </w:p>
+        </w:tc>
+      </w:tr>
+      <w:tr>
+        <w:tc>
+          <w:tcPr>
+            <w:tcW w:w="2880" w:type="dxa"/>
+          </w:tcPr>
+          <w:p>
+            <w:r>
               <w:t>500 Internal Server Error</w:t>
             </w:r>
           </w:p>
@@ -401,6 +433,1024 @@
           <w:p>
             <w:r>
               <w:t>Unhandled exception</w:t>
+            </w:r>
+          </w:p>
+        </w:tc>
+      </w:tr>
+    </w:tbl>
+    <w:p>
+      <w:pPr>
+        <w:pStyle w:val="Heading2"/>
+      </w:pPr>
+      <w:r>
+        <w:t>1.3  Standard Error Response</w:t>
+      </w:r>
+    </w:p>
+    <w:p>
+      <w:r>
+        <w:t>All 4xx and 5xx responses return a JSON body in this format:</w:t>
+      </w:r>
+    </w:p>
+    <w:p>
+      <w:r>
+        <w:rPr>
+          <w:rFonts w:ascii="Courier New" w:hAnsi="Courier New"/>
+        </w:rPr>
+        <w:t>{ "error": "Human-readable description of the problem" }</w:t>
+      </w:r>
+    </w:p>
+    <w:p>
+      <w:r>
+        <w:t>For upstream service failures (502), an optional detail field is included:</w:t>
+      </w:r>
+    </w:p>
+    <w:p>
+      <w:r>
+        <w:rPr>
+          <w:rFonts w:ascii="Courier New" w:hAnsi="Courier New"/>
+        </w:rPr>
+        <w:t>{ "error": "Student Service unavailable",</w:t>
+        <w:br/>
+        <w:t xml:space="preserve">  "detail": "connect ECONNREFUSED 172.18.0.3:3001" }</w:t>
+      </w:r>
+    </w:p>
+    <w:p>
+      <w:r>
+        <w:t>Error Code Reference:</w:t>
+      </w:r>
+    </w:p>
+    <w:tbl>
+      <w:tblPr>
+        <w:tblStyle w:val="TableGrid"/>
+        <w:tblW w:type="auto" w:w="0"/>
+        <w:tblLook w:firstColumn="1" w:firstRow="1" w:lastColumn="0" w:lastRow="0" w:noHBand="0" w:noVBand="1" w:val="04A0"/>
+      </w:tblPr>
+      <w:tblGrid>
+        <w:gridCol w:w="2880"/>
+        <w:gridCol w:w="2880"/>
+        <w:gridCol w:w="2880"/>
+      </w:tblGrid>
+      <w:tr>
+        <w:tc>
+          <w:tcPr>
+            <w:tcW w:type="dxa" w:w="2880"/>
+          </w:tcPr>
+          <w:p>
+            <w:r>
+              <w:rPr>
+                <w:b/>
+              </w:rPr>
+              <w:t>HTTP Code</w:t>
+            </w:r>
+          </w:p>
+        </w:tc>
+        <w:tc>
+          <w:tcPr>
+            <w:tcW w:type="dxa" w:w="2880"/>
+          </w:tcPr>
+          <w:p>
+            <w:r>
+              <w:rPr>
+                <w:b/>
+              </w:rPr>
+              <w:t>Meaning</w:t>
+            </w:r>
+          </w:p>
+        </w:tc>
+        <w:tc>
+          <w:tcPr>
+            <w:tcW w:type="dxa" w:w="2880"/>
+          </w:tcPr>
+          <w:p>
+            <w:r>
+              <w:rPr>
+                <w:b/>
+              </w:rPr>
+              <w:t>Example error value</w:t>
+            </w:r>
+          </w:p>
+        </w:tc>
+      </w:tr>
+      <w:tr>
+        <w:tc>
+          <w:tcPr>
+            <w:tcW w:type="dxa" w:w="2880"/>
+          </w:tcPr>
+          <w:p>
+            <w:r>
+              <w:t>400 Bad Request</w:t>
+            </w:r>
+          </w:p>
+        </w:tc>
+        <w:tc>
+          <w:tcPr>
+            <w:tcW w:type="dxa" w:w="2880"/>
+          </w:tcPr>
+          <w:p>
+            <w:r>
+              <w:t>Validation failed / bad input</w:t>
+            </w:r>
+          </w:p>
+        </w:tc>
+        <w:tc>
+          <w:tcPr>
+            <w:tcW w:type="dxa" w:w="2880"/>
+          </w:tcPr>
+          <w:p>
+            <w:r>
+              <w:t>"name is required"</w:t>
+            </w:r>
+          </w:p>
+        </w:tc>
+      </w:tr>
+      <w:tr>
+        <w:tc>
+          <w:tcPr>
+            <w:tcW w:type="dxa" w:w="2880"/>
+          </w:tcPr>
+          <w:p>
+            <w:r>
+              <w:t>401 Unauthorized</w:t>
+            </w:r>
+          </w:p>
+        </w:tc>
+        <w:tc>
+          <w:tcPr>
+            <w:tcW w:type="dxa" w:w="2880"/>
+          </w:tcPr>
+          <w:p>
+            <w:r>
+              <w:t>Missing or invalid JWT token</w:t>
+            </w:r>
+          </w:p>
+        </w:tc>
+        <w:tc>
+          <w:tcPr>
+            <w:tcW w:type="dxa" w:w="2880"/>
+          </w:tcPr>
+          <w:p>
+            <w:r>
+              <w:t>"No token provided" / "Invalid token"</w:t>
+            </w:r>
+          </w:p>
+        </w:tc>
+      </w:tr>
+      <w:tr>
+        <w:tc>
+          <w:tcPr>
+            <w:tcW w:type="dxa" w:w="2880"/>
+          </w:tcPr>
+          <w:p>
+            <w:r>
+              <w:t>403 Forbidden</w:t>
+            </w:r>
+          </w:p>
+        </w:tc>
+        <w:tc>
+          <w:tcPr>
+            <w:tcW w:type="dxa" w:w="2880"/>
+          </w:tcPr>
+          <w:p>
+            <w:r>
+              <w:t>Authenticated but insufficient role</w:t>
+            </w:r>
+          </w:p>
+        </w:tc>
+        <w:tc>
+          <w:tcPr>
+            <w:tcW w:type="dxa" w:w="2880"/>
+          </w:tcPr>
+          <w:p>
+            <w:r>
+              <w:t>"Forbidden"</w:t>
+            </w:r>
+          </w:p>
+        </w:tc>
+      </w:tr>
+      <w:tr>
+        <w:tc>
+          <w:tcPr>
+            <w:tcW w:type="dxa" w:w="2880"/>
+          </w:tcPr>
+          <w:p>
+            <w:r>
+              <w:t>404 Not Found</w:t>
+            </w:r>
+          </w:p>
+        </w:tc>
+        <w:tc>
+          <w:tcPr>
+            <w:tcW w:type="dxa" w:w="2880"/>
+          </w:tcPr>
+          <w:p>
+            <w:r>
+              <w:t>Resource not found</w:t>
+            </w:r>
+          </w:p>
+        </w:tc>
+        <w:tc>
+          <w:tcPr>
+            <w:tcW w:type="dxa" w:w="2880"/>
+          </w:tcPr>
+          <w:p>
+            <w:r>
+              <w:t>"Student not found"</w:t>
+            </w:r>
+          </w:p>
+        </w:tc>
+      </w:tr>
+      <w:tr>
+        <w:tc>
+          <w:tcPr>
+            <w:tcW w:type="dxa" w:w="2880"/>
+          </w:tcPr>
+          <w:p>
+            <w:r>
+              <w:t>409 Conflict</w:t>
+            </w:r>
+          </w:p>
+        </w:tc>
+        <w:tc>
+          <w:tcPr>
+            <w:tcW w:type="dxa" w:w="2880"/>
+          </w:tcPr>
+          <w:p>
+            <w:r>
+              <w:t>Unique constraint violated</w:t>
+            </w:r>
+          </w:p>
+        </w:tc>
+        <w:tc>
+          <w:tcPr>
+            <w:tcW w:type="dxa" w:w="2880"/>
+          </w:tcPr>
+          <w:p>
+            <w:r>
+              <w:t>"Email or studentId already exists"</w:t>
+            </w:r>
+          </w:p>
+        </w:tc>
+      </w:tr>
+      <w:tr>
+        <w:tc>
+          <w:tcPr>
+            <w:tcW w:type="dxa" w:w="2880"/>
+          </w:tcPr>
+          <w:p>
+            <w:r>
+              <w:t>502 Bad Gateway</w:t>
+            </w:r>
+          </w:p>
+        </w:tc>
+        <w:tc>
+          <w:tcPr>
+            <w:tcW w:type="dxa" w:w="2880"/>
+          </w:tcPr>
+          <w:p>
+            <w:r>
+              <w:t>Upstream service unavailable</w:t>
+            </w:r>
+          </w:p>
+        </w:tc>
+        <w:tc>
+          <w:tcPr>
+            <w:tcW w:type="dxa" w:w="2880"/>
+          </w:tcPr>
+          <w:p>
+            <w:r>
+              <w:t>"Student Service unavailable"</w:t>
+            </w:r>
+          </w:p>
+        </w:tc>
+      </w:tr>
+      <w:tr>
+        <w:tc>
+          <w:tcPr>
+            <w:tcW w:type="dxa" w:w="2880"/>
+          </w:tcPr>
+          <w:p>
+            <w:r>
+              <w:t>500 Internal Server Error</w:t>
+            </w:r>
+          </w:p>
+        </w:tc>
+        <w:tc>
+          <w:tcPr>
+            <w:tcW w:type="dxa" w:w="2880"/>
+          </w:tcPr>
+          <w:p>
+            <w:r>
+              <w:t>Unexpected server error</w:t>
+            </w:r>
+          </w:p>
+        </w:tc>
+        <w:tc>
+          <w:tcPr>
+            <w:tcW w:type="dxa" w:w="2880"/>
+          </w:tcPr>
+          <w:p>
+            <w:r>
+              <w:t>"Internal server error"</w:t>
+            </w:r>
+          </w:p>
+        </w:tc>
+      </w:tr>
+    </w:tbl>
+    <w:p>
+      <w:pPr>
+        <w:pStyle w:val="Heading2"/>
+      </w:pPr>
+      <w:r>
+        <w:t>1.4  Role-Based Access Control</w:t>
+      </w:r>
+    </w:p>
+    <w:p>
+      <w:r>
+        <w:t>All authenticated endpoints enforce role-based access. The five roles defined in the Auth Service are:</w:t>
+      </w:r>
+    </w:p>
+    <w:tbl>
+      <w:tblPr>
+        <w:tblStyle w:val="TableGrid"/>
+        <w:tblW w:type="auto" w:w="0"/>
+        <w:tblLook w:firstColumn="1" w:firstRow="1" w:lastColumn="0" w:lastRow="0" w:noHBand="0" w:noVBand="1" w:val="04A0"/>
+      </w:tblPr>
+      <w:tblGrid>
+        <w:gridCol w:w="4320"/>
+        <w:gridCol w:w="4320"/>
+      </w:tblGrid>
+      <w:tr>
+        <w:tc>
+          <w:tcPr>
+            <w:tcW w:type="dxa" w:w="4320"/>
+          </w:tcPr>
+          <w:p>
+            <w:r>
+              <w:rPr>
+                <w:b/>
+              </w:rPr>
+              <w:t>Role</w:t>
+            </w:r>
+          </w:p>
+        </w:tc>
+        <w:tc>
+          <w:tcPr>
+            <w:tcW w:type="dxa" w:w="4320"/>
+          </w:tcPr>
+          <w:p>
+            <w:r>
+              <w:rPr>
+                <w:b/>
+              </w:rPr>
+              <w:t>Description</w:t>
+            </w:r>
+          </w:p>
+        </w:tc>
+      </w:tr>
+      <w:tr>
+        <w:tc>
+          <w:tcPr>
+            <w:tcW w:type="dxa" w:w="4320"/>
+          </w:tcPr>
+          <w:p>
+            <w:r>
+              <w:t>ADMIN</w:t>
+            </w:r>
+          </w:p>
+        </w:tc>
+        <w:tc>
+          <w:tcPr>
+            <w:tcW w:type="dxa" w:w="4320"/>
+          </w:tcPr>
+          <w:p>
+            <w:r>
+              <w:t>Full access — create users, manage all data, bulk import, assign specializations</w:t>
+            </w:r>
+          </w:p>
+        </w:tc>
+      </w:tr>
+      <w:tr>
+        <w:tc>
+          <w:tcPr>
+            <w:tcW w:type="dxa" w:w="4320"/>
+          </w:tcPr>
+          <w:p>
+            <w:r>
+              <w:t>EXAM_DIVISION</w:t>
+            </w:r>
+          </w:p>
+        </w:tc>
+        <w:tc>
+          <w:tcPr>
+            <w:tcW w:type="dxa" w:w="4320"/>
+          </w:tcPr>
+          <w:p>
+            <w:r>
+              <w:t>Manage exams, results, registration windows, approve/reject entries, upload results</w:t>
+            </w:r>
+          </w:p>
+        </w:tc>
+      </w:tr>
+      <w:tr>
+        <w:tc>
+          <w:tcPr>
+            <w:tcW w:type="dxa" w:w="4320"/>
+          </w:tcPr>
+          <w:p>
+            <w:r>
+              <w:t>HOD</w:t>
+            </w:r>
+          </w:p>
+        </w:tc>
+        <w:tc>
+          <w:tcPr>
+            <w:tcW w:type="dxa" w:w="4320"/>
+          </w:tcPr>
+          <w:p>
+            <w:r>
+              <w:t>Approve or reject exam entries; read-only access to all student, exam, and result data</w:t>
+            </w:r>
+          </w:p>
+        </w:tc>
+      </w:tr>
+      <w:tr>
+        <w:tc>
+          <w:tcPr>
+            <w:tcW w:type="dxa" w:w="4320"/>
+          </w:tcPr>
+          <w:p>
+            <w:r>
+              <w:t>LECTURER</w:t>
+            </w:r>
+          </w:p>
+        </w:tc>
+        <w:tc>
+          <w:tcPr>
+            <w:tcW w:type="dxa" w:w="4320"/>
+          </w:tcPr>
+          <w:p>
+            <w:r>
+              <w:t>Approve or reject exam entries; read-only access to results</w:t>
+            </w:r>
+          </w:p>
+        </w:tc>
+      </w:tr>
+      <w:tr>
+        <w:tc>
+          <w:tcPr>
+            <w:tcW w:type="dxa" w:w="4320"/>
+          </w:tcPr>
+          <w:p>
+            <w:r>
+              <w:t>STUDENT</w:t>
+            </w:r>
+          </w:p>
+        </w:tc>
+        <w:tc>
+          <w:tcPr>
+            <w:tcW w:type="dxa" w:w="4320"/>
+          </w:tcPr>
+          <w:p>
+            <w:r>
+              <w:t>View own enrolment and results; apply for specialization; upload own photo</w:t>
+            </w:r>
+          </w:p>
+        </w:tc>
+      </w:tr>
+    </w:tbl>
+    <w:p>
+      <w:r>
+        <w:t>The table below lists the permitted roles for each write/management endpoint. All GET endpoints are readable by every authenticated role unless stated otherwise.</w:t>
+      </w:r>
+    </w:p>
+    <w:tbl>
+      <w:tblPr>
+        <w:tblStyle w:val="TableGrid"/>
+        <w:tblW w:type="auto" w:w="0"/>
+        <w:tblLook w:firstColumn="1" w:firstRow="1" w:lastColumn="0" w:lastRow="0" w:noHBand="0" w:noVBand="1" w:val="04A0"/>
+      </w:tblPr>
+      <w:tblGrid>
+        <w:gridCol w:w="2880"/>
+        <w:gridCol w:w="2880"/>
+        <w:gridCol w:w="2880"/>
+      </w:tblGrid>
+      <w:tr>
+        <w:tc>
+          <w:tcPr>
+            <w:tcW w:type="dxa" w:w="2880"/>
+          </w:tcPr>
+          <w:p>
+            <w:r>
+              <w:rPr>
+                <w:b/>
+              </w:rPr>
+              <w:t>Endpoint</w:t>
+            </w:r>
+          </w:p>
+        </w:tc>
+        <w:tc>
+          <w:tcPr>
+            <w:tcW w:type="dxa" w:w="2880"/>
+          </w:tcPr>
+          <w:p>
+            <w:r>
+              <w:rPr>
+                <w:b/>
+              </w:rPr>
+              <w:t>Allowed Roles</w:t>
+            </w:r>
+          </w:p>
+        </w:tc>
+        <w:tc>
+          <w:tcPr>
+            <w:tcW w:type="dxa" w:w="2880"/>
+          </w:tcPr>
+          <w:p>
+            <w:r>
+              <w:rPr>
+                <w:b/>
+              </w:rPr>
+              <w:t>Notes</w:t>
+            </w:r>
+          </w:p>
+        </w:tc>
+      </w:tr>
+      <w:tr>
+        <w:tc>
+          <w:tcPr>
+            <w:tcW w:type="dxa" w:w="2880"/>
+          </w:tcPr>
+          <w:p>
+            <w:r>
+              <w:t>POST /api/students</w:t>
+            </w:r>
+          </w:p>
+        </w:tc>
+        <w:tc>
+          <w:tcPr>
+            <w:tcW w:type="dxa" w:w="2880"/>
+          </w:tcPr>
+          <w:p>
+            <w:r>
+              <w:t>ADMIN, EXAM_DIVISION</w:t>
+            </w:r>
+          </w:p>
+        </w:tc>
+        <w:tc>
+          <w:tcPr>
+            <w:tcW w:type="dxa" w:w="2880"/>
+          </w:tcPr>
+          <w:p>
+            <w:r>
+              <w:t>Create student account</w:t>
+            </w:r>
+          </w:p>
+        </w:tc>
+      </w:tr>
+      <w:tr>
+        <w:tc>
+          <w:tcPr>
+            <w:tcW w:type="dxa" w:w="2880"/>
+          </w:tcPr>
+          <w:p>
+            <w:r>
+              <w:t>POST /api/students/bulk</w:t>
+            </w:r>
+          </w:p>
+        </w:tc>
+        <w:tc>
+          <w:tcPr>
+            <w:tcW w:type="dxa" w:w="2880"/>
+          </w:tcPr>
+          <w:p>
+            <w:r>
+              <w:t>ADMIN, EXAM_DIVISION</w:t>
+            </w:r>
+          </w:p>
+        </w:tc>
+        <w:tc>
+          <w:tcPr>
+            <w:tcW w:type="dxa" w:w="2880"/>
+          </w:tcPr>
+          <w:p>
+            <w:r>
+              <w:t>Bulk CSV import</w:t>
+            </w:r>
+          </w:p>
+        </w:tc>
+      </w:tr>
+      <w:tr>
+        <w:tc>
+          <w:tcPr>
+            <w:tcW w:type="dxa" w:w="2880"/>
+          </w:tcPr>
+          <w:p>
+            <w:r>
+              <w:t>PATCH /api/students/:id</w:t>
+            </w:r>
+          </w:p>
+        </w:tc>
+        <w:tc>
+          <w:tcPr>
+            <w:tcW w:type="dxa" w:w="2880"/>
+          </w:tcPr>
+          <w:p>
+            <w:r>
+              <w:t>ADMIN, EXAM_DIVISION (full); STUDENT (own, limited fields)</w:t>
+            </w:r>
+          </w:p>
+        </w:tc>
+        <w:tc>
+          <w:tcPr>
+            <w:tcW w:type="dxa" w:w="2880"/>
+          </w:tcPr>
+          <w:p>
+            <w:r>
+              <w:t>Cannot change studentId, email, nic, permanentDistrict</w:t>
+            </w:r>
+          </w:p>
+        </w:tc>
+      </w:tr>
+      <w:tr>
+        <w:tc>
+          <w:tcPr>
+            <w:tcW w:type="dxa" w:w="2880"/>
+          </w:tcPr>
+          <w:p>
+            <w:r>
+              <w:t>POST /api/students/:id/photo</w:t>
+            </w:r>
+          </w:p>
+        </w:tc>
+        <w:tc>
+          <w:tcPr>
+            <w:tcW w:type="dxa" w:w="2880"/>
+          </w:tcPr>
+          <w:p>
+            <w:r>
+              <w:t>ADMIN, EXAM_DIVISION</w:t>
+            </w:r>
+          </w:p>
+        </w:tc>
+        <w:tc>
+          <w:tcPr>
+            <w:tcW w:type="dxa" w:w="2880"/>
+          </w:tcPr>
+          <w:p>
+            <w:r>
+              <w:t>Profile photo upload</w:t>
+            </w:r>
+          </w:p>
+        </w:tc>
+      </w:tr>
+      <w:tr>
+        <w:tc>
+          <w:tcPr>
+            <w:tcW w:type="dxa" w:w="2880"/>
+          </w:tcPr>
+          <w:p>
+            <w:r>
+              <w:t>POST /api/students/:id/year-registration</w:t>
+            </w:r>
+          </w:p>
+        </w:tc>
+        <w:tc>
+          <w:tcPr>
+            <w:tcW w:type="dxa" w:w="2880"/>
+          </w:tcPr>
+          <w:p>
+            <w:r>
+              <w:t>ADMIN, EXAM_DIVISION</w:t>
+            </w:r>
+          </w:p>
+        </w:tc>
+        <w:tc>
+          <w:tcPr>
+            <w:tcW w:type="dxa" w:w="2880"/>
+          </w:tcPr>
+          <w:p>
+            <w:r>
+              <w:t>Academic year enrolment</w:t>
+            </w:r>
+          </w:p>
+        </w:tc>
+      </w:tr>
+      <w:tr>
+        <w:tc>
+          <w:tcPr>
+            <w:tcW w:type="dxa" w:w="2880"/>
+          </w:tcPr>
+          <w:p>
+            <w:r>
+              <w:t>POST /api/exams</w:t>
+            </w:r>
+          </w:p>
+        </w:tc>
+        <w:tc>
+          <w:tcPr>
+            <w:tcW w:type="dxa" w:w="2880"/>
+          </w:tcPr>
+          <w:p>
+            <w:r>
+              <w:t>ADMIN, EXAM_DIVISION</w:t>
+            </w:r>
+          </w:p>
+        </w:tc>
+        <w:tc>
+          <w:tcPr>
+            <w:tcW w:type="dxa" w:w="2880"/>
+          </w:tcPr>
+          <w:p>
+            <w:r>
+              <w:t>Create exam</w:t>
+            </w:r>
+          </w:p>
+        </w:tc>
+      </w:tr>
+      <w:tr>
+        <w:tc>
+          <w:tcPr>
+            <w:tcW w:type="dxa" w:w="2880"/>
+          </w:tcPr>
+          <w:p>
+            <w:r>
+              <w:t>PATCH /api/exams/:id/schedule</w:t>
+            </w:r>
+          </w:p>
+        </w:tc>
+        <w:tc>
+          <w:tcPr>
+            <w:tcW w:type="dxa" w:w="2880"/>
+          </w:tcPr>
+          <w:p>
+            <w:r>
+              <w:t>ADMIN, EXAM_DIVISION</w:t>
+            </w:r>
+          </w:p>
+        </w:tc>
+        <w:tc>
+          <w:tcPr>
+            <w:tcW w:type="dxa" w:w="2880"/>
+          </w:tcPr>
+          <w:p>
+            <w:r>
+              <w:t>Set registration window dates</w:t>
+            </w:r>
+          </w:p>
+        </w:tc>
+      </w:tr>
+      <w:tr>
+        <w:tc>
+          <w:tcPr>
+            <w:tcW w:type="dxa" w:w="2880"/>
+          </w:tcPr>
+          <w:p>
+            <w:r>
+              <w:t>PATCH /api/exams/:id/toggle</w:t>
+            </w:r>
+          </w:p>
+        </w:tc>
+        <w:tc>
+          <w:tcPr>
+            <w:tcW w:type="dxa" w:w="2880"/>
+          </w:tcPr>
+          <w:p>
+            <w:r>
+              <w:t>ADMIN, EXAM_DIVISION</w:t>
+            </w:r>
+          </w:p>
+        </w:tc>
+        <w:tc>
+          <w:tcPr>
+            <w:tcW w:type="dxa" w:w="2880"/>
+          </w:tcPr>
+          <w:p>
+            <w:r>
+              <w:t>Open or close exam registration</w:t>
+            </w:r>
+          </w:p>
+        </w:tc>
+      </w:tr>
+      <w:tr>
+        <w:tc>
+          <w:tcPr>
+            <w:tcW w:type="dxa" w:w="2880"/>
+          </w:tcPr>
+          <w:p>
+            <w:r>
+              <w:t>PATCH /api/exams/:id/entries/:entryId</w:t>
+            </w:r>
+          </w:p>
+        </w:tc>
+        <w:tc>
+          <w:tcPr>
+            <w:tcW w:type="dxa" w:w="2880"/>
+          </w:tcPr>
+          <w:p>
+            <w:r>
+              <w:t>ADMIN, EXAM_DIVISION, HOD, LECTURER</w:t>
+            </w:r>
+          </w:p>
+        </w:tc>
+        <w:tc>
+          <w:tcPr>
+            <w:tcW w:type="dxa" w:w="2880"/>
+          </w:tcPr>
+          <w:p>
+            <w:r>
+              <w:t>Approve or reject an exam entry</w:t>
+            </w:r>
+          </w:p>
+        </w:tc>
+      </w:tr>
+      <w:tr>
+        <w:tc>
+          <w:tcPr>
+            <w:tcW w:type="dxa" w:w="2880"/>
+          </w:tcPr>
+          <w:p>
+            <w:r>
+              <w:t>POST /api/results</w:t>
+            </w:r>
+          </w:p>
+        </w:tc>
+        <w:tc>
+          <w:tcPr>
+            <w:tcW w:type="dxa" w:w="2880"/>
+          </w:tcPr>
+          <w:p>
+            <w:r>
+              <w:t>ADMIN, EXAM_DIVISION</w:t>
+            </w:r>
+          </w:p>
+        </w:tc>
+        <w:tc>
+          <w:tcPr>
+            <w:tcW w:type="dxa" w:w="2880"/>
+          </w:tcPr>
+          <w:p>
+            <w:r>
+              <w:t>Upload subject result</w:t>
+            </w:r>
+          </w:p>
+        </w:tc>
+      </w:tr>
+      <w:tr>
+        <w:tc>
+          <w:tcPr>
+            <w:tcW w:type="dxa" w:w="2880"/>
+          </w:tcPr>
+          <w:p>
+            <w:r>
+              <w:t>POST /api/results/bulk</w:t>
+            </w:r>
+          </w:p>
+        </w:tc>
+        <w:tc>
+          <w:tcPr>
+            <w:tcW w:type="dxa" w:w="2880"/>
+          </w:tcPr>
+          <w:p>
+            <w:r>
+              <w:t>ADMIN, EXAM_DIVISION</w:t>
+            </w:r>
+          </w:p>
+        </w:tc>
+        <w:tc>
+          <w:tcPr>
+            <w:tcW w:type="dxa" w:w="2880"/>
+          </w:tcPr>
+          <w:p>
+            <w:r>
+              <w:t>Bulk CSV result import</w:t>
+            </w:r>
+          </w:p>
+        </w:tc>
+      </w:tr>
+      <w:tr>
+        <w:tc>
+          <w:tcPr>
+            <w:tcW w:type="dxa" w:w="2880"/>
+          </w:tcPr>
+          <w:p>
+            <w:r>
+              <w:t>PATCH /api/results/gpa/:id/finalize</w:t>
+            </w:r>
+          </w:p>
+        </w:tc>
+        <w:tc>
+          <w:tcPr>
+            <w:tcW w:type="dxa" w:w="2880"/>
+          </w:tcPr>
+          <w:p>
+            <w:r>
+              <w:t>ADMIN, EXAM_DIVISION</w:t>
+            </w:r>
+          </w:p>
+        </w:tc>
+        <w:tc>
+          <w:tcPr>
+            <w:tcW w:type="dxa" w:w="2880"/>
+          </w:tcPr>
+          <w:p>
+            <w:r>
+              <w:t>Finalise year GPA record</w:t>
+            </w:r>
+          </w:p>
+        </w:tc>
+      </w:tr>
+      <w:tr>
+        <w:tc>
+          <w:tcPr>
+            <w:tcW w:type="dxa" w:w="2880"/>
+          </w:tcPr>
+          <w:p>
+            <w:r>
+              <w:t>PATCH /api/specializations/:id/assign</w:t>
+            </w:r>
+          </w:p>
+        </w:tc>
+        <w:tc>
+          <w:tcPr>
+            <w:tcW w:type="dxa" w:w="2880"/>
+          </w:tcPr>
+          <w:p>
+            <w:r>
+              <w:t>ADMIN, EXAM_DIVISION</w:t>
+            </w:r>
+          </w:p>
+        </w:tc>
+        <w:tc>
+          <w:tcPr>
+            <w:tcW w:type="dxa" w:w="2880"/>
+          </w:tcPr>
+          <w:p>
+            <w:r>
+              <w:t>Assign specialization to student</w:t>
+            </w:r>
+          </w:p>
+        </w:tc>
+      </w:tr>
+      <w:tr>
+        <w:tc>
+          <w:tcPr>
+            <w:tcW w:type="dxa" w:w="2880"/>
+          </w:tcPr>
+          <w:p>
+            <w:r>
+              <w:t>GET /api/notifications</w:t>
+            </w:r>
+          </w:p>
+        </w:tc>
+        <w:tc>
+          <w:tcPr>
+            <w:tcW w:type="dxa" w:w="2880"/>
+          </w:tcPr>
+          <w:p>
+            <w:r>
+              <w:t>ADMIN, EXAM_DIVISION, HOD, LECTURER</w:t>
+            </w:r>
+          </w:p>
+        </w:tc>
+        <w:tc>
+          <w:tcPr>
+            <w:tcW w:type="dxa" w:w="2880"/>
+          </w:tcPr>
+          <w:p>
+            <w:r>
+              <w:t>View Kafka event audit log</w:t>
+            </w:r>
+          </w:p>
+        </w:tc>
+      </w:tr>
+      <w:tr>
+        <w:tc>
+          <w:tcPr>
+            <w:tcW w:type="dxa" w:w="2880"/>
+          </w:tcPr>
+          <w:p>
+            <w:r>
+              <w:t>All GET endpoints</w:t>
+            </w:r>
+          </w:p>
+        </w:tc>
+        <w:tc>
+          <w:tcPr>
+            <w:tcW w:type="dxa" w:w="2880"/>
+          </w:tcPr>
+          <w:p>
+            <w:r>
+              <w:t>All authenticated roles</w:t>
+            </w:r>
+          </w:p>
+        </w:tc>
+        <w:tc>
+          <w:tcPr>
+            <w:tcW w:type="dxa" w:w="2880"/>
+          </w:tcPr>
+          <w:p>
+            <w:r>
+              <w:t>Read access for every authenticated user</w:t>
             </w:r>
           </w:p>
         </w:tc>

</xml_diff>